<commit_message>
Add initial R scripts for tidyverse and package installations; update comments and document text
</commit_message>
<xml_diff>
--- a/data/doc_1.docx
+++ b/data/doc_1.docx
@@ -7,7 +7,7 @@
         <w:pStyle w:val="Titre1"/>
       </w:pPr>
       <w:r>
-        <w:t xml:space="preserve">大項目(heading 1)</w:t>
+        <w:t xml:space="preserve">heading 1</w:t>
       </w:r>
     </w:p>
     <w:p>
@@ -15,7 +15,7 @@
         <w:pStyle w:val="Titre2"/>
       </w:pPr>
       <w:r>
-        <w:t xml:space="preserve">中項目(heading 2)</w:t>
+        <w:t xml:space="preserve">heading 2</w:t>
       </w:r>
     </w:p>
     <w:p>
@@ -23,7 +23,7 @@
         <w:pStyle w:val="Normal"/>
       </w:pPr>
       <w:r>
-        <w:t xml:space="preserve">これは2ページ目の本文です．</w:t>
+        <w:t xml:space="preserve">This is the text of the first page.</w:t>
       </w:r>
     </w:p>
     <w:p>
@@ -31,7 +31,7 @@
         <w:pStyle w:val="Normal"/>
       </w:pPr>
       <w:r>
-        <w:t xml:space="preserve">「オラウータン」は間違いです．</w:t>
+        <w:t xml:space="preserve">'Orautan' is a wrong ...</w:t>
       </w:r>
     </w:p>
     <w:p>
@@ -39,7 +39,7 @@
         <w:pStyle w:val="Normal"/>
       </w:pPr>
       <w:r>
-        <w:t xml:space="preserve">「オランウータン」が正解です．</w:t>
+        <w:t xml:space="preserve">'Orangutan' is correct ...</w:t>
       </w:r>
     </w:p>
     <w:p>
@@ -47,7 +47,7 @@
         <w:pStyle w:val="Normal"/>
       </w:pPr>
       <w:r>
-        <w:t xml:space="preserve">「オラウンタン」も違います．</w:t>
+        <w:t xml:space="preserve">The 'orauntan' is also wrong ...</w:t>
       </w:r>
     </w:p>
     <w:p>
@@ -61,7 +61,7 @@
         <w:pStyle w:val="Normal"/>
       </w:pPr>
       <w:r>
-        <w:t xml:space="preserve">これは2ページ目の本文です．</w:t>
+        <w:t xml:space="preserve">This is the text of the second page.</w:t>
       </w:r>
     </w:p>
     <w:p>
@@ -69,7 +69,7 @@
         <w:pStyle w:val="Normal"/>
       </w:pPr>
       <w:r>
-        <w:t xml:space="preserve">甲南女子学園は2020年11月27日に100周年を迎えました．</w:t>
+        <w:t xml:space="preserve">Monday, March 18, 2025: graduation ceremony</w:t>
       </w:r>
     </w:p>
     <w:p>
@@ -77,7 +77,7 @@
         <w:pStyle w:val="Normal"/>
       </w:pPr>
       <w:r>
-        <w:t xml:space="preserve">2025年3月18日(月)：卒業式</w:t>
+        <w:t xml:space="preserve">April 3, 2025 (Fri): Entrance Ceremony </w:t>
       </w:r>
     </w:p>
     <w:p>
@@ -85,7 +85,7 @@
         <w:pStyle w:val="Normal"/>
       </w:pPr>
       <w:r>
-        <w:t xml:space="preserve">2025年4月3日(金)：入学式</w:t>
+        <w:t xml:space="preserve">The day of the week is not confirmed .</w:t>
       </w:r>
     </w:p>
     <w:p>
@@ -93,15 +93,7 @@
         <w:pStyle w:val="Normal"/>
       </w:pPr>
       <w:r>
-        <w:t xml:space="preserve">曜日は未確認です．</w:t>
-      </w:r>
-    </w:p>
-    <w:p>
-      <w:pPr>
-        <w:pStyle w:val="Normal"/>
-      </w:pPr>
-      <w:r>
-        <w:t xml:space="preserve">これは長い文章の例です．これは長い文章の例です．これは長い文章の例です．これは長い文章の例です．これは長い文章の例です．</w:t>
+        <w:t xml:space="preserve">This is an example of a long sentence. This is an example of a long sentence. This is an example of a long sentence. This is an example of a long sentence. This is an example of a long sentence.</w:t>
       </w:r>
     </w:p>
     <w:p>
@@ -665,11 +657,11 @@
         <w:rPr>
           <w:rFonts/>
         </w:rPr>
-        <w:t xml:space="preserve">これはコメントのない部分です．</w:t>
+        <w:t xml:space="preserve">This is an uncommented section.</w:t>
       </w:r>
       <w:commentRangeStart w:id="0"/>
       <w:r>
-        <w:t xml:space="preserve">コメントが追加された部分の本文です．</w:t>
+        <w:t xml:space="preserve">This is the text of the section to which the comment was added.</w:t>
       </w:r>
       <w:commentRangeEnd w:id="0"/>
       <w:r>
@@ -689,7 +681,7 @@
 
 <file path=word/comments.xml><?xml version="1.0" encoding="utf-8"?>
 <w:comments xmlns:wpc="http://schemas.microsoft.com/office/word/2010/wordprocessingCanvas" xmlns:mo="http://schemas.microsoft.com/office/mac/office/2008/main" xmlns:mc="http://schemas.openxmlformats.org/markup-compatibility/2006" xmlns:mv="urn:schemas-microsoft-com:mac:vml" xmlns:o="urn:schemas-microsoft-com:office:office" xmlns:r="http://schemas.openxmlformats.org/officeDocument/2006/relationships" xmlns:m="http://schemas.openxmlformats.org/officeDocument/2006/math" xmlns:v="urn:schemas-microsoft-com:vml" xmlns:wp14="http://schemas.microsoft.com/office/word/2010/wordprocessingDrawing" xmlns:wp="http://schemas.openxmlformats.org/drawingml/2006/wordprocessingDrawing" xmlns:w10="urn:schemas-microsoft-com:office:word" xmlns:w="http://schemas.openxmlformats.org/wordprocessingml/2006/main" xmlns:w14="http://schemas.microsoft.com/office/word/2010/wordml" xmlns:wpg="http://schemas.microsoft.com/office/word/2010/wordprocessingGroup" xmlns:wpi="http://schemas.microsoft.com/office/word/2010/wordprocessingInk" xmlns:wne="http://schemas.microsoft.com/office/word/2006/wordml" xmlns:wps="http://schemas.microsoft.com/office/word/2010/wordprocessingShape" mc:Ignorable="w14 wp14">
-  <w:comment w:id="0" w:author="コメントの著者" w:date="2024-08-24" w:initials="MT">
+  <w:comment w:id="0" w:author="Author of the comment" w:date="2025-06-20" w:initials="MT">
     <w:p>
       <w:pPr>
         <w:pStyle w:val="Normal"/>
@@ -707,7 +699,7 @@
         <w:rPr>
           <w:rFonts/>
         </w:rPr>
-        <w:t xml:space="preserve">これはコメントです．</w:t>
+        <w:t xml:space="preserve">This is a comment.</w:t>
       </w:r>
     </w:p>
   </w:comment>

</xml_diff>

<commit_message>
Translate document content to Japanese and update headings
</commit_message>
<xml_diff>
--- a/data/doc_1.docx
+++ b/data/doc_1.docx
@@ -7,7 +7,7 @@
         <w:pStyle w:val="Titre1"/>
       </w:pPr>
       <w:r>
-        <w:t xml:space="preserve">heading 1</w:t>
+        <w:t xml:space="preserve">大項目(heading 1)</w:t>
       </w:r>
     </w:p>
     <w:p>
@@ -15,7 +15,7 @@
         <w:pStyle w:val="Titre2"/>
       </w:pPr>
       <w:r>
-        <w:t xml:space="preserve">heading 2</w:t>
+        <w:t xml:space="preserve">中項目(heading 2)</w:t>
       </w:r>
     </w:p>
     <w:p>
@@ -23,7 +23,7 @@
         <w:pStyle w:val="Normal"/>
       </w:pPr>
       <w:r>
-        <w:t xml:space="preserve">This is the text of the first page.</w:t>
+        <w:t xml:space="preserve">これは2ページ目の本文です．</w:t>
       </w:r>
     </w:p>
     <w:p>
@@ -31,7 +31,7 @@
         <w:pStyle w:val="Normal"/>
       </w:pPr>
       <w:r>
-        <w:t xml:space="preserve">'Orautan' is a wrong ...</w:t>
+        <w:t xml:space="preserve">「オラウータン」は間違いです．</w:t>
       </w:r>
     </w:p>
     <w:p>
@@ -39,7 +39,7 @@
         <w:pStyle w:val="Normal"/>
       </w:pPr>
       <w:r>
-        <w:t xml:space="preserve">'Orangutan' is correct ...</w:t>
+        <w:t xml:space="preserve">「オランウータン」が正解です．</w:t>
       </w:r>
     </w:p>
     <w:p>
@@ -47,7 +47,7 @@
         <w:pStyle w:val="Normal"/>
       </w:pPr>
       <w:r>
-        <w:t xml:space="preserve">The 'orauntan' is also wrong ...</w:t>
+        <w:t xml:space="preserve">「オラウンタン」も違います．</w:t>
       </w:r>
     </w:p>
     <w:p>
@@ -61,7 +61,7 @@
         <w:pStyle w:val="Normal"/>
       </w:pPr>
       <w:r>
-        <w:t xml:space="preserve">This is the text of the second page.</w:t>
+        <w:t xml:space="preserve">これは2ページ目の本文です．</w:t>
       </w:r>
     </w:p>
     <w:p>
@@ -69,7 +69,7 @@
         <w:pStyle w:val="Normal"/>
       </w:pPr>
       <w:r>
-        <w:t xml:space="preserve">Monday, March 18, 2025: graduation ceremony</w:t>
+        <w:t xml:space="preserve">甲南女子学園は2020年11月27日に100周年を迎えました．</w:t>
       </w:r>
     </w:p>
     <w:p>
@@ -77,7 +77,7 @@
         <w:pStyle w:val="Normal"/>
       </w:pPr>
       <w:r>
-        <w:t xml:space="preserve">April 3, 2025 (Fri): Entrance Ceremony </w:t>
+        <w:t xml:space="preserve">2025年3月18日(月)：卒業式</w:t>
       </w:r>
     </w:p>
     <w:p>
@@ -85,7 +85,7 @@
         <w:pStyle w:val="Normal"/>
       </w:pPr>
       <w:r>
-        <w:t xml:space="preserve">The day of the week is not confirmed .</w:t>
+        <w:t xml:space="preserve">2025年4月3日(金)：入学式</w:t>
       </w:r>
     </w:p>
     <w:p>
@@ -93,7 +93,15 @@
         <w:pStyle w:val="Normal"/>
       </w:pPr>
       <w:r>
-        <w:t xml:space="preserve">This is an example of a long sentence. This is an example of a long sentence. This is an example of a long sentence. This is an example of a long sentence. This is an example of a long sentence.</w:t>
+        <w:t xml:space="preserve">曜日は未確認です．</w:t>
+      </w:r>
+    </w:p>
+    <w:p>
+      <w:pPr>
+        <w:pStyle w:val="Normal"/>
+      </w:pPr>
+      <w:r>
+        <w:t xml:space="preserve">これは長い文章の例です．これは長い文章の例です．これは長い文章の例です．これは長い文章の例です．これは長い文章の例です．</w:t>
       </w:r>
     </w:p>
     <w:p>
@@ -125,7 +133,7 @@
                     </pic:cNvPicPr>
                   </pic:nvPicPr>
                   <pic:blipFill>
-                    <a:blip cstate="print" r:embed="rId8"/>
+                    <a:blip r:embed="rId8"/>
                     <a:stretch>
                       <a:fillRect/>
                     </a:stretch>
@@ -170,7 +178,7 @@
                     </pic:cNvPicPr>
                   </pic:nvPicPr>
                   <pic:blipFill>
-                    <a:blip cstate="print" r:embed="rId9"/>
+                    <a:blip r:embed="rId9"/>
                     <a:stretch>
                       <a:fillRect/>
                     </a:stretch>
@@ -212,7 +220,7 @@
         <w:tc>
           <w:p>
             <w:pPr>
-              <w:pStyle w:stlname="Normal" w:val="Normal"/>
+              <w:pStyle w:val="Normal"/>
             </w:pPr>
             <w:r>
               <w:t>manufacturer</w:t>
@@ -222,7 +230,7 @@
         <w:tc>
           <w:p>
             <w:pPr>
-              <w:pStyle w:stlname="Normal" w:val="Normal"/>
+              <w:pStyle w:val="Normal"/>
             </w:pPr>
             <w:r>
               <w:t>model</w:t>
@@ -232,7 +240,7 @@
         <w:tc>
           <w:p>
             <w:pPr>
-              <w:pStyle w:stlname="Normal" w:val="Normal"/>
+              <w:pStyle w:val="Normal"/>
             </w:pPr>
             <w:r>
               <w:t>displ</w:t>
@@ -242,7 +250,7 @@
         <w:tc>
           <w:p>
             <w:pPr>
-              <w:pStyle w:stlname="Normal" w:val="Normal"/>
+              <w:pStyle w:val="Normal"/>
             </w:pPr>
             <w:r>
               <w:t>year</w:t>
@@ -252,7 +260,7 @@
         <w:tc>
           <w:p>
             <w:pPr>
-              <w:pStyle w:stlname="Normal" w:val="Normal"/>
+              <w:pStyle w:val="Normal"/>
             </w:pPr>
             <w:r>
               <w:t>cyl</w:t>
@@ -262,7 +270,7 @@
         <w:tc>
           <w:p>
             <w:pPr>
-              <w:pStyle w:stlname="Normal" w:val="Normal"/>
+              <w:pStyle w:val="Normal"/>
             </w:pPr>
             <w:r>
               <w:t>trans</w:t>
@@ -274,7 +282,7 @@
         <w:tc>
           <w:p>
             <w:pPr>
-              <w:pStyle w:stlname="Normal" w:val="Normal"/>
+              <w:pStyle w:val="Normal"/>
             </w:pPr>
             <w:r>
               <w:t>audi</w:t>
@@ -284,7 +292,7 @@
         <w:tc>
           <w:p>
             <w:pPr>
-              <w:pStyle w:stlname="Normal" w:val="Normal"/>
+              <w:pStyle w:val="Normal"/>
             </w:pPr>
             <w:r>
               <w:t>a4</w:t>
@@ -294,7 +302,7 @@
         <w:tc>
           <w:p>
             <w:pPr>
-              <w:pStyle w:stlname="Normal" w:val="Normal"/>
+              <w:pStyle w:val="Normal"/>
             </w:pPr>
             <w:r>
               <w:t>1.8</w:t>
@@ -304,7 +312,7 @@
         <w:tc>
           <w:p>
             <w:pPr>
-              <w:pStyle w:stlname="Normal" w:val="Normal"/>
+              <w:pStyle w:val="Normal"/>
             </w:pPr>
             <w:r>
               <w:t>1999</w:t>
@@ -314,7 +322,7 @@
         <w:tc>
           <w:p>
             <w:pPr>
-              <w:pStyle w:stlname="Normal" w:val="Normal"/>
+              <w:pStyle w:val="Normal"/>
             </w:pPr>
             <w:r>
               <w:t>4</w:t>
@@ -324,7 +332,7 @@
         <w:tc>
           <w:p>
             <w:pPr>
-              <w:pStyle w:stlname="Normal" w:val="Normal"/>
+              <w:pStyle w:val="Normal"/>
             </w:pPr>
             <w:r>
               <w:t>auto(l5)</w:t>
@@ -336,7 +344,7 @@
         <w:tc>
           <w:p>
             <w:pPr>
-              <w:pStyle w:stlname="Normal" w:val="Normal"/>
+              <w:pStyle w:val="Normal"/>
             </w:pPr>
             <w:r>
               <w:t>audi</w:t>
@@ -346,7 +354,7 @@
         <w:tc>
           <w:p>
             <w:pPr>
-              <w:pStyle w:stlname="Normal" w:val="Normal"/>
+              <w:pStyle w:val="Normal"/>
             </w:pPr>
             <w:r>
               <w:t>a4</w:t>
@@ -356,7 +364,7 @@
         <w:tc>
           <w:p>
             <w:pPr>
-              <w:pStyle w:stlname="Normal" w:val="Normal"/>
+              <w:pStyle w:val="Normal"/>
             </w:pPr>
             <w:r>
               <w:t>1.8</w:t>
@@ -366,7 +374,7 @@
         <w:tc>
           <w:p>
             <w:pPr>
-              <w:pStyle w:stlname="Normal" w:val="Normal"/>
+              <w:pStyle w:val="Normal"/>
             </w:pPr>
             <w:r>
               <w:t>1999</w:t>
@@ -376,7 +384,7 @@
         <w:tc>
           <w:p>
             <w:pPr>
-              <w:pStyle w:stlname="Normal" w:val="Normal"/>
+              <w:pStyle w:val="Normal"/>
             </w:pPr>
             <w:r>
               <w:t>4</w:t>
@@ -386,7 +394,7 @@
         <w:tc>
           <w:p>
             <w:pPr>
-              <w:pStyle w:stlname="Normal" w:val="Normal"/>
+              <w:pStyle w:val="Normal"/>
             </w:pPr>
             <w:r>
               <w:t>manual(m5)</w:t>
@@ -398,7 +406,7 @@
         <w:tc>
           <w:p>
             <w:pPr>
-              <w:pStyle w:stlname="Normal" w:val="Normal"/>
+              <w:pStyle w:val="Normal"/>
             </w:pPr>
             <w:r>
               <w:t>audi</w:t>
@@ -408,7 +416,7 @@
         <w:tc>
           <w:p>
             <w:pPr>
-              <w:pStyle w:stlname="Normal" w:val="Normal"/>
+              <w:pStyle w:val="Normal"/>
             </w:pPr>
             <w:r>
               <w:t>a4</w:t>
@@ -418,7 +426,7 @@
         <w:tc>
           <w:p>
             <w:pPr>
-              <w:pStyle w:stlname="Normal" w:val="Normal"/>
+              <w:pStyle w:val="Normal"/>
             </w:pPr>
             <w:r>
               <w:t>2.0</w:t>
@@ -428,7 +436,7 @@
         <w:tc>
           <w:p>
             <w:pPr>
-              <w:pStyle w:stlname="Normal" w:val="Normal"/>
+              <w:pStyle w:val="Normal"/>
             </w:pPr>
             <w:r>
               <w:t>2008</w:t>
@@ -438,7 +446,7 @@
         <w:tc>
           <w:p>
             <w:pPr>
-              <w:pStyle w:stlname="Normal" w:val="Normal"/>
+              <w:pStyle w:val="Normal"/>
             </w:pPr>
             <w:r>
               <w:t>4</w:t>
@@ -448,7 +456,7 @@
         <w:tc>
           <w:p>
             <w:pPr>
-              <w:pStyle w:stlname="Normal" w:val="Normal"/>
+              <w:pStyle w:val="Normal"/>
             </w:pPr>
             <w:r>
               <w:t>manual(m6)</w:t>
@@ -460,7 +468,7 @@
         <w:tc>
           <w:p>
             <w:pPr>
-              <w:pStyle w:stlname="Normal" w:val="Normal"/>
+              <w:pStyle w:val="Normal"/>
             </w:pPr>
             <w:r>
               <w:t>audi</w:t>
@@ -470,7 +478,7 @@
         <w:tc>
           <w:p>
             <w:pPr>
-              <w:pStyle w:stlname="Normal" w:val="Normal"/>
+              <w:pStyle w:val="Normal"/>
             </w:pPr>
             <w:r>
               <w:t>a4</w:t>
@@ -480,7 +488,7 @@
         <w:tc>
           <w:p>
             <w:pPr>
-              <w:pStyle w:stlname="Normal" w:val="Normal"/>
+              <w:pStyle w:val="Normal"/>
             </w:pPr>
             <w:r>
               <w:t>2.0</w:t>
@@ -490,7 +498,7 @@
         <w:tc>
           <w:p>
             <w:pPr>
-              <w:pStyle w:stlname="Normal" w:val="Normal"/>
+              <w:pStyle w:val="Normal"/>
             </w:pPr>
             <w:r>
               <w:t>2008</w:t>
@@ -500,7 +508,7 @@
         <w:tc>
           <w:p>
             <w:pPr>
-              <w:pStyle w:stlname="Normal" w:val="Normal"/>
+              <w:pStyle w:val="Normal"/>
             </w:pPr>
             <w:r>
               <w:t>4</w:t>
@@ -510,7 +518,7 @@
         <w:tc>
           <w:p>
             <w:pPr>
-              <w:pStyle w:stlname="Normal" w:val="Normal"/>
+              <w:pStyle w:val="Normal"/>
             </w:pPr>
             <w:r>
               <w:t>auto(av)</w:t>
@@ -522,7 +530,7 @@
         <w:tc>
           <w:p>
             <w:pPr>
-              <w:pStyle w:stlname="Normal" w:val="Normal"/>
+              <w:pStyle w:val="Normal"/>
             </w:pPr>
             <w:r>
               <w:t>audi</w:t>
@@ -532,7 +540,7 @@
         <w:tc>
           <w:p>
             <w:pPr>
-              <w:pStyle w:stlname="Normal" w:val="Normal"/>
+              <w:pStyle w:val="Normal"/>
             </w:pPr>
             <w:r>
               <w:t>a4</w:t>
@@ -542,7 +550,7 @@
         <w:tc>
           <w:p>
             <w:pPr>
-              <w:pStyle w:stlname="Normal" w:val="Normal"/>
+              <w:pStyle w:val="Normal"/>
             </w:pPr>
             <w:r>
               <w:t>2.8</w:t>
@@ -552,7 +560,7 @@
         <w:tc>
           <w:p>
             <w:pPr>
-              <w:pStyle w:stlname="Normal" w:val="Normal"/>
+              <w:pStyle w:val="Normal"/>
             </w:pPr>
             <w:r>
               <w:t>1999</w:t>
@@ -562,7 +570,7 @@
         <w:tc>
           <w:p>
             <w:pPr>
-              <w:pStyle w:stlname="Normal" w:val="Normal"/>
+              <w:pStyle w:val="Normal"/>
             </w:pPr>
             <w:r>
               <w:t>6</w:t>
@@ -572,7 +580,7 @@
         <w:tc>
           <w:p>
             <w:pPr>
-              <w:pStyle w:stlname="Normal" w:val="Normal"/>
+              <w:pStyle w:val="Normal"/>
             </w:pPr>
             <w:r>
               <w:t>auto(l5)</w:t>
@@ -584,7 +592,7 @@
         <w:tc>
           <w:p>
             <w:pPr>
-              <w:pStyle w:stlname="Normal" w:val="Normal"/>
+              <w:pStyle w:val="Normal"/>
             </w:pPr>
             <w:r>
               <w:t>audi</w:t>
@@ -594,7 +602,7 @@
         <w:tc>
           <w:p>
             <w:pPr>
-              <w:pStyle w:stlname="Normal" w:val="Normal"/>
+              <w:pStyle w:val="Normal"/>
             </w:pPr>
             <w:r>
               <w:t>a4</w:t>
@@ -604,7 +612,7 @@
         <w:tc>
           <w:p>
             <w:pPr>
-              <w:pStyle w:stlname="Normal" w:val="Normal"/>
+              <w:pStyle w:val="Normal"/>
             </w:pPr>
             <w:r>
               <w:t>2.8</w:t>
@@ -614,7 +622,7 @@
         <w:tc>
           <w:p>
             <w:pPr>
-              <w:pStyle w:stlname="Normal" w:val="Normal"/>
+              <w:pStyle w:val="Normal"/>
             </w:pPr>
             <w:r>
               <w:t>1999</w:t>
@@ -624,7 +632,7 @@
         <w:tc>
           <w:p>
             <w:pPr>
-              <w:pStyle w:stlname="Normal" w:val="Normal"/>
+              <w:pStyle w:val="Normal"/>
             </w:pPr>
             <w:r>
               <w:t>6</w:t>
@@ -634,7 +642,7 @@
         <w:tc>
           <w:p>
             <w:pPr>
-              <w:pStyle w:stlname="Normal" w:val="Normal"/>
+              <w:pStyle w:val="Normal"/>
             </w:pPr>
             <w:r>
               <w:t>manual(m5)</w:t>
@@ -657,15 +665,16 @@
         <w:rPr>
           <w:rFonts/>
         </w:rPr>
-        <w:t xml:space="preserve">This is an uncommented section.</w:t>
-      </w:r>
-      <w:commentRangeStart w:id="0"/>
-      <w:r>
-        <w:t xml:space="preserve">This is the text of the section to which the comment was added.</w:t>
-      </w:r>
-      <w:commentRangeEnd w:id="0"/>
-      <w:r>
-        <w:commentReference w:id="0"/>
+        <w:t xml:space="preserve">これはコメントのない部分です．</w:t>
+      </w:r>
+      <w:commentRangeStart w:officer="true" w:id="0"/>
+      <w:r>
+        <w:t xml:space="preserve">コメントが追加された部分の本文です．</w:t>
+      </w:r>
+      <w:commentRangeEnd w:officer="true" w:id="0"/>
+      <w:r>
+        <w:commentReference w:officer="true" w:id="0">
+</w:commentReference>
       </w:r>
     </w:p>
     <w:sectPr>
@@ -681,7 +690,7 @@
 
 <file path=word/comments.xml><?xml version="1.0" encoding="utf-8"?>
 <w:comments xmlns:wpc="http://schemas.microsoft.com/office/word/2010/wordprocessingCanvas" xmlns:mo="http://schemas.microsoft.com/office/mac/office/2008/main" xmlns:mc="http://schemas.openxmlformats.org/markup-compatibility/2006" xmlns:mv="urn:schemas-microsoft-com:mac:vml" xmlns:o="urn:schemas-microsoft-com:office:office" xmlns:r="http://schemas.openxmlformats.org/officeDocument/2006/relationships" xmlns:m="http://schemas.openxmlformats.org/officeDocument/2006/math" xmlns:v="urn:schemas-microsoft-com:vml" xmlns:wp14="http://schemas.microsoft.com/office/word/2010/wordprocessingDrawing" xmlns:wp="http://schemas.openxmlformats.org/drawingml/2006/wordprocessingDrawing" xmlns:w10="urn:schemas-microsoft-com:office:word" xmlns:w="http://schemas.openxmlformats.org/wordprocessingml/2006/main" xmlns:w14="http://schemas.microsoft.com/office/word/2010/wordml" xmlns:wpg="http://schemas.microsoft.com/office/word/2010/wordprocessingGroup" xmlns:wpi="http://schemas.microsoft.com/office/word/2010/wordprocessingInk" xmlns:wne="http://schemas.microsoft.com/office/word/2006/wordml" xmlns:wps="http://schemas.microsoft.com/office/word/2010/wordprocessingShape" mc:Ignorable="w14 wp14">
-  <w:comment w:id="0" w:author="Author of the comment" w:date="2025-06-20" w:initials="MT">
+  <w:comment w:id="0" w:author="コメントの筆者" w:date="2025-06-24" w:initials="MT">
     <w:p>
       <w:pPr>
         <w:pStyle w:val="Normal"/>
@@ -699,7 +708,7 @@
         <w:rPr>
           <w:rFonts/>
         </w:rPr>
-        <w:t xml:space="preserve">This is a comment.</w:t>
+        <w:t xml:space="preserve">これはコメントです．</w:t>
       </w:r>
     </w:p>
   </w:comment>

</xml_diff>